<commit_message>
docs: clarify scope of GenOS resume contributions
</commit_message>
<xml_diff>
--- a/public/Michael_Grier_Resume.docx
+++ b/public/Michael_Grier_Resume.docx
@@ -186,7 +186,7 @@
         <w:pStyle w:val="ListBullet"/>
       </w:pPr>
       <w:r>
-        <w:t>Migrated event data from REST to GraphQL and replaced a 1,700-line shared React component with focused wind, solar, and hydro modules.</w:t>
+        <w:t>Refactored legacy React components across the application into smaller, focused modules to improve maintainability. Migrated event data from REST to GraphQL.</w:t>
       </w:r>
     </w:p>
     <w:p>
@@ -194,7 +194,7 @@
         <w:pStyle w:val="ListBullet"/>
       </w:pPr>
       <w:r>
-        <w:t>Built reusable mobile and tablet modals for event details and monitoring graphs; established Docker builds and Azure Pipelines across three environments.</w:t>
+        <w:t>Built comprehensive mobile and tablet views across the entire application, introducing responsive design where none existed before. Established Docker builds and Azure Pipelines across three environments.</w:t>
       </w:r>
     </w:p>
     <w:p>

</xml_diff>

<commit_message>
docs: explain Athena datastore usage
</commit_message>
<xml_diff>
--- a/public/Michael_Grier_Resume.docx
+++ b/public/Michael_Grier_Resume.docx
@@ -131,6 +131,14 @@
       </w:pPr>
       <w:r>
         <w:t>Enabled SQL-fluent analysts to create their own dashboards within the platform using reusable ECharts cards and chart presets.</w:t>
+      </w:r>
+    </w:p>
+    <w:p>
+      <w:pPr>
+        <w:pStyle w:val="ListBullet"/>
+      </w:pPr>
+      <w:r>
+        <w:t>Used Databricks as the primary analytics datastore, with PostgreSQL supporting latency-sensitive features such as authentication and comments.</w:t>
       </w:r>
     </w:p>
     <w:p>
@@ -1054,7 +1062,7 @@
     <w:rsid w:val="00FC693F"/>
     <w:pPr>
       <w:widowControl/>
-      <w:spacing w:line="250" w:lineRule="auto" w:after="80"/>
+      <w:spacing w:line="240" w:lineRule="auto" w:after="80"/>
     </w:pPr>
     <w:rPr>
       <w:rFonts w:ascii="Familjen Grotesk" w:hAnsi="Familjen Grotesk" w:eastAsia="Familjen Grotesk" w:cs="Familjen Grotesk"/>
@@ -1172,7 +1180,7 @@
     <w:pPr>
       <w:keepNext/>
       <w:keepLines/>
-      <w:spacing w:before="200" w:after="100"/>
+      <w:spacing w:before="120" w:after="100"/>
       <w:outlineLvl w:val="2"/>
     </w:pPr>
     <w:rPr>

</xml_diff>

<commit_message>
docs: clarify TransAlta resume contributions (#14)
* docs: clarify scope of GenOS resume contributions

* docs: explain Athena datastore usage
</commit_message>
<xml_diff>
--- a/public/Michael_Grier_Resume.docx
+++ b/public/Michael_Grier_Resume.docx
@@ -138,6 +138,14 @@
         <w:pStyle w:val="ListBullet"/>
       </w:pPr>
       <w:r>
+        <w:t>Used Databricks as the primary analytics datastore, with PostgreSQL supporting latency-sensitive features such as authentication and comments.</w:t>
+      </w:r>
+    </w:p>
+    <w:p>
+      <w:pPr>
+        <w:pStyle w:val="ListBullet"/>
+      </w:pPr>
+      <w:r>
         <w:t>Built a data-catalog workflow with draft submissions, multi-stage review, rework, and audit trails.</w:t>
       </w:r>
     </w:p>
@@ -186,7 +194,7 @@
         <w:pStyle w:val="ListBullet"/>
       </w:pPr>
       <w:r>
-        <w:t>Migrated event data from REST to GraphQL and replaced a 1,700-line shared React component with focused wind, solar, and hydro modules.</w:t>
+        <w:t>Refactored legacy React components across the application into smaller, focused modules to improve maintainability. Migrated event data from REST to GraphQL.</w:t>
       </w:r>
     </w:p>
     <w:p>
@@ -194,7 +202,7 @@
         <w:pStyle w:val="ListBullet"/>
       </w:pPr>
       <w:r>
-        <w:t>Built reusable mobile and tablet modals for event details and monitoring graphs; established Docker builds and Azure Pipelines across three environments.</w:t>
+        <w:t>Built comprehensive mobile and tablet views across the entire application, introducing responsive design where none existed before. Established Docker builds and Azure Pipelines across three environments.</w:t>
       </w:r>
     </w:p>
     <w:p>
@@ -1054,7 +1062,7 @@
     <w:rsid w:val="00FC693F"/>
     <w:pPr>
       <w:widowControl/>
-      <w:spacing w:line="250" w:lineRule="auto" w:after="80"/>
+      <w:spacing w:line="240" w:lineRule="auto" w:after="80"/>
     </w:pPr>
     <w:rPr>
       <w:rFonts w:ascii="Familjen Grotesk" w:hAnsi="Familjen Grotesk" w:eastAsia="Familjen Grotesk" w:cs="Familjen Grotesk"/>
@@ -1172,7 +1180,7 @@
     <w:pPr>
       <w:keepNext/>
       <w:keepLines/>
-      <w:spacing w:before="200" w:after="100"/>
+      <w:spacing w:before="120" w:after="100"/>
       <w:outlineLvl w:val="2"/>
     </w:pPr>
     <w:rPr>

</xml_diff>

<commit_message>
docs: clarify team experience and balance resume layout
</commit_message>
<xml_diff>
--- a/public/Michael_Grier_Resume.docx
+++ b/public/Michael_Grier_Resume.docx
@@ -43,7 +43,7 @@
     <w:p>
       <w:pPr>
         <w:pStyle w:val="Contact"/>
-        <w:spacing w:after="240"/>
+        <w:spacing w:after="120"/>
       </w:pPr>
       <w:r>
         <w:t xml:space="preserve">GitHub: </w:t>
@@ -70,7 +70,7 @@
     </w:p>
     <w:p>
       <w:r>
-        <w:t>I'm a full-stack developer with five years of experience building reporting and management applications and automating business processes. I focus on simple, easy to use interfaces and clear communication, drawing on my background in education. My independent projects include a custom ecommerce site, a native mobile app, and an interactive learning platform for developers.</w:t>
+        <w:t>I'm a full-stack developer with five years of experience building reporting and management applications and automating business processes. I focus on clean interfaces, reliable architecture, and clear communication. My background in education shapes how I explain technical decisions and collaborate with others.</w:t>
       </w:r>
     </w:p>
     <w:p>
@@ -102,6 +102,11 @@
       </w:r>
     </w:p>
     <w:p>
+      <w:r>
+        <w:t>Worked on a team of three software developers and three data engineers, sharing responsibility for architecture, UI design, development, testing, infrastructure, deployment, and maintenance.</w:t>
+      </w:r>
+    </w:p>
+    <w:p>
       <w:pPr>
         <w:pStyle w:val="Heading3"/>
       </w:pPr>
@@ -120,6 +125,7 @@
     <w:p>
       <w:pPr>
         <w:pStyle w:val="ListBullet"/>
+        <w:contextualSpacing w:val="0"/>
       </w:pPr>
       <w:r>
         <w:t>Contributed the majority of code to a Next.js and TypeScript production reporting platform with real-time dashboards for wind, hydro, solar, and natural gas management teams and senior leadership.</w:t>
@@ -128,6 +134,7 @@
     <w:p>
       <w:pPr>
         <w:pStyle w:val="ListBullet"/>
+        <w:contextualSpacing w:val="0"/>
       </w:pPr>
       <w:r>
         <w:t>Enabled SQL-fluent analysts to create their own dashboards within the platform using reusable ECharts cards and chart presets.</w:t>
@@ -136,6 +143,7 @@
     <w:p>
       <w:pPr>
         <w:pStyle w:val="ListBullet"/>
+        <w:contextualSpacing w:val="0"/>
       </w:pPr>
       <w:r>
         <w:t>Used Databricks as the primary analytics datastore, with PostgreSQL supporting latency-sensitive features such as authentication and comments.</w:t>
@@ -144,14 +152,16 @@
     <w:p>
       <w:pPr>
         <w:pStyle w:val="ListBullet"/>
+        <w:contextualSpacing w:val="0"/>
       </w:pPr>
       <w:r>
-        <w:t>Built a data-catalog workflow with draft submissions, multi-stage review, rework, and audit trails.</w:t>
+        <w:t>Built a data catalog management workflow with draft submissions, multi-stage review, rework, and audit trails.</w:t>
       </w:r>
     </w:p>
     <w:p>
       <w:pPr>
         <w:pStyle w:val="ListBullet"/>
+        <w:contextualSpacing w:val="0"/>
       </w:pPr>
       <w:r>
         <w:t>Implemented Microsoft Entra ID SSO, PostgreSQL-backed sessions, and distributed locking for token refresh across application instances.</w:t>
@@ -160,6 +170,7 @@
     <w:p>
       <w:pPr>
         <w:pStyle w:val="ListBullet"/>
+        <w:contextualSpacing w:val="0"/>
       </w:pPr>
       <w:r>
         <w:t>Built Terraform and GitHub Actions delivery workflows across development, UAT, and production, including release promotion, hotfixes, and rollback.</w:t>
@@ -168,9 +179,10 @@
     <w:p>
       <w:pPr>
         <w:pStyle w:val="ListBullet"/>
+        <w:contextualSpacing w:val="0"/>
       </w:pPr>
       <w:r>
-        <w:t>Worked with management teams, analysts, and data engineers to define reporting requirements, plan tasks, and refine fuel-specific dashboards through user feedback.</w:t>
+        <w:t>Worked with analysts and management teams to define reporting requirements and refine dashboards through user feedback.</w:t>
       </w:r>
     </w:p>
     <w:p>
@@ -192,6 +204,7 @@
     <w:p>
       <w:pPr>
         <w:pStyle w:val="ListBullet"/>
+        <w:contextualSpacing w:val="0"/>
       </w:pPr>
       <w:r>
         <w:t>Refactored legacy React components across the application into smaller, focused modules to improve maintainability. Migrated event data from REST to GraphQL.</w:t>
@@ -200,6 +213,7 @@
     <w:p>
       <w:pPr>
         <w:pStyle w:val="ListBullet"/>
+        <w:contextualSpacing w:val="0"/>
       </w:pPr>
       <w:r>
         <w:t>Built comprehensive mobile and tablet views across the entire application, introducing responsive design where none existed before. Established Docker builds and Azure Pipelines across three environments.</w:t>
@@ -208,6 +222,7 @@
     <w:p>
       <w:pPr>
         <w:pStyle w:val="ListBullet"/>
+        <w:contextualSpacing w:val="0"/>
       </w:pPr>
       <w:r>
         <w:t>Fixed SQL Server connection leaks and strengthened JWT verification. Corrected capacity values, event filtering, and multi-unit CSV exports used in NERC reporting.</w:t>
@@ -233,6 +248,18 @@
     <w:p>
       <w:r>
         <w:t>Developed and maintained automations using Blue Prism and Python scripting. Translated stakeholder requirements into reusable process components and handled testing, scheduled execution, and production troubleshooting.</w:t>
+      </w:r>
+    </w:p>
+    <w:p>
+      <w:pPr>
+        <w:pStyle w:val="Heading1"/>
+        <w:pageBreakBefore/>
+        <w:pBdr>
+          <w:bottom w:val="single" w:sz="6" w:space="5" w:color="0078BF"/>
+        </w:pBdr>
+      </w:pPr>
+      <w:r>
+        <w:t>Earlier experience</w:t>
       </w:r>
     </w:p>
     <w:p>
@@ -282,7 +309,6 @@
     <w:p>
       <w:pPr>
         <w:pStyle w:val="Heading1"/>
-        <w:pageBreakBefore/>
         <w:pBdr>
           <w:bottom w:val="single" w:sz="6" w:space="5" w:color="0078BF"/>
         </w:pBdr>
@@ -302,7 +328,7 @@
     <w:p>
       <w:pPr>
         <w:pStyle w:val="Heading2"/>
-        <w:spacing w:before="240" w:after="40"/>
+        <w:spacing w:before="160" w:after="40"/>
       </w:pPr>
       <w:hyperlink r:id="rId12">
         <w:r>
@@ -316,7 +342,7 @@
     <w:p>
       <w:pPr>
         <w:pStyle w:val="Detail"/>
-        <w:spacing w:after="140"/>
+        <w:spacing w:after="60"/>
       </w:pPr>
       <w:r>
         <w:t>Checkout, inventory, and order management for an independent skateboard brand</w:t>
@@ -338,7 +364,7 @@
     <w:p>
       <w:pPr>
         <w:pStyle w:val="Heading2"/>
-        <w:spacing w:before="240" w:after="40"/>
+        <w:spacing w:before="160" w:after="40"/>
       </w:pPr>
       <w:hyperlink r:id="rId13">
         <w:r>
@@ -352,7 +378,7 @@
     <w:p>
       <w:pPr>
         <w:pStyle w:val="Detail"/>
-        <w:spacing w:after="140"/>
+        <w:spacing w:after="60"/>
       </w:pPr>
       <w:r>
         <w:t>Community skateboarding map for Calgary</w:t>
@@ -374,7 +400,7 @@
     <w:p>
       <w:pPr>
         <w:pStyle w:val="Heading2"/>
-        <w:spacing w:before="240" w:after="40"/>
+        <w:spacing w:before="160" w:after="40"/>
       </w:pPr>
       <w:hyperlink r:id="rId14">
         <w:r>
@@ -388,7 +414,7 @@
     <w:p>
       <w:pPr>
         <w:pStyle w:val="Detail"/>
-        <w:spacing w:after="140"/>
+        <w:spacing w:after="60"/>
       </w:pPr>
       <w:r>
         <w:t>Interactive TypeScript interview practice</w:t>
@@ -420,7 +446,7 @@
     </w:p>
     <w:p>
       <w:pPr>
-        <w:spacing w:after="140"/>
+        <w:spacing w:after="80"/>
       </w:pPr>
       <w:r>
         <w:rPr>
@@ -434,7 +460,7 @@
     </w:p>
     <w:p>
       <w:pPr>
-        <w:spacing w:after="140"/>
+        <w:spacing w:after="80"/>
       </w:pPr>
       <w:r>
         <w:rPr>
@@ -448,7 +474,7 @@
     </w:p>
     <w:p>
       <w:pPr>
-        <w:spacing w:after="140"/>
+        <w:spacing w:after="80"/>
       </w:pPr>
       <w:r>
         <w:rPr>
@@ -462,7 +488,7 @@
     </w:p>
     <w:p>
       <w:pPr>
-        <w:spacing w:after="140"/>
+        <w:spacing w:after="80"/>
       </w:pPr>
       <w:r>
         <w:rPr>
@@ -488,7 +514,7 @@
     <w:p>
       <w:pPr>
         <w:keepLines/>
-        <w:spacing w:after="160"/>
+        <w:spacing w:after="80"/>
       </w:pPr>
       <w:r>
         <w:rPr>
@@ -497,14 +523,13 @@
         <w:t>Object-Oriented Software Development Certificate</w:t>
       </w:r>
       <w:r>
-        <w:br/>
-        <w:t>Southern Alberta Institute of Technology  |  2020 · GPA 3.98</w:t>
+        <w:t xml:space="preserve">  |  Southern Alberta Institute of Technology  |  2020 · GPA 3.98</w:t>
       </w:r>
     </w:p>
     <w:p>
       <w:pPr>
         <w:keepLines/>
-        <w:spacing w:after="160"/>
+        <w:spacing w:after="80"/>
       </w:pPr>
       <w:r>
         <w:rPr>
@@ -513,14 +538,13 @@
         <w:t>Bachelor of Education</w:t>
       </w:r>
       <w:r>
-        <w:br/>
-        <w:t>University of Calgary  |  2016</w:t>
+        <w:t xml:space="preserve">  |  University of Calgary  |  2016</w:t>
       </w:r>
     </w:p>
     <w:p>
       <w:pPr>
         <w:keepLines/>
-        <w:spacing w:after="160"/>
+        <w:spacing w:after="80"/>
       </w:pPr>
       <w:r>
         <w:rPr>
@@ -529,8 +553,7 @@
         <w:t>Bachelor of Arts</w:t>
       </w:r>
       <w:r>
-        <w:br/>
-        <w:t>University of Calgary  |  2011</w:t>
+        <w:t xml:space="preserve">  |  University of Calgary  |  2011</w:t>
       </w:r>
     </w:p>
     <w:sectPr>
@@ -1062,7 +1085,7 @@
     <w:rsid w:val="00FC693F"/>
     <w:pPr>
       <w:widowControl/>
-      <w:spacing w:line="240" w:lineRule="auto" w:after="80"/>
+      <w:spacing w:line="250" w:lineRule="auto" w:after="40"/>
     </w:pPr>
     <w:rPr>
       <w:rFonts w:ascii="Familjen Grotesk" w:hAnsi="Familjen Grotesk" w:eastAsia="Familjen Grotesk" w:cs="Familjen Grotesk"/>
@@ -1128,7 +1151,7 @@
     <w:pPr>
       <w:keepNext/>
       <w:keepLines/>
-      <w:spacing w:before="200" w:after="240"/>
+      <w:spacing w:before="200" w:after="160"/>
       <w:outlineLvl w:val="0"/>
     </w:pPr>
     <w:rPr>
@@ -1180,7 +1203,7 @@
     <w:pPr>
       <w:keepNext/>
       <w:keepLines/>
-      <w:spacing w:before="120" w:after="100"/>
+      <w:spacing w:before="80" w:after="100"/>
       <w:outlineLvl w:val="2"/>
     </w:pPr>
     <w:rPr>
@@ -12782,7 +12805,7 @@
     <w:name w:val="Contact"/>
     <w:pPr>
       <w:keepNext/>
-      <w:spacing w:after="80"/>
+      <w:spacing w:after="40"/>
     </w:pPr>
     <w:rPr>
       <w:rFonts w:ascii="Familjen Grotesk" w:hAnsi="Familjen Grotesk" w:eastAsia="Familjen Grotesk" w:cs="Familjen Grotesk"/>
@@ -12797,7 +12820,7 @@
     <w:name w:val="Detail"/>
     <w:pPr>
       <w:keepNext/>
-      <w:spacing w:after="80"/>
+      <w:spacing w:after="40"/>
     </w:pPr>
     <w:rPr>
       <w:rFonts w:ascii="Familjen Grotesk" w:hAnsi="Familjen Grotesk" w:eastAsia="Familjen Grotesk" w:cs="Familjen Grotesk"/>
@@ -12812,7 +12835,7 @@
     <w:name w:val="Folio"/>
     <w:pPr>
       <w:keepNext/>
-      <w:spacing w:after="80"/>
+      <w:spacing w:after="40"/>
     </w:pPr>
     <w:rPr>
       <w:rFonts w:ascii="Familjen Grotesk" w:hAnsi="Familjen Grotesk" w:eastAsia="Familjen Grotesk" w:cs="Familjen Grotesk"/>

</xml_diff>

<commit_message>
docs: clarify team experience and balance resume layout (#15)
</commit_message>
<xml_diff>
--- a/public/Michael_Grier_Resume.docx
+++ b/public/Michael_Grier_Resume.docx
@@ -43,7 +43,7 @@
     <w:p>
       <w:pPr>
         <w:pStyle w:val="Contact"/>
-        <w:spacing w:after="240"/>
+        <w:spacing w:after="120"/>
       </w:pPr>
       <w:r>
         <w:t xml:space="preserve">GitHub: </w:t>
@@ -70,7 +70,7 @@
     </w:p>
     <w:p>
       <w:r>
-        <w:t>I'm a full-stack developer with five years of experience building reporting and management applications and automating business processes. I focus on simple, easy to use interfaces and clear communication, drawing on my background in education. My independent projects include a custom ecommerce site, a native mobile app, and an interactive learning platform for developers.</w:t>
+        <w:t>I'm a full-stack developer with five years of experience building reporting and management applications and automating business processes. I focus on clean interfaces, reliable architecture, and clear communication. My background in education shapes how I explain technical decisions and collaborate with others.</w:t>
       </w:r>
     </w:p>
     <w:p>
@@ -102,6 +102,11 @@
       </w:r>
     </w:p>
     <w:p>
+      <w:r>
+        <w:t>Worked on a team of three software developers and three data engineers, sharing responsibility for architecture, UI design, development, testing, infrastructure, deployment, and maintenance.</w:t>
+      </w:r>
+    </w:p>
+    <w:p>
       <w:pPr>
         <w:pStyle w:val="Heading3"/>
       </w:pPr>
@@ -120,6 +125,7 @@
     <w:p>
       <w:pPr>
         <w:pStyle w:val="ListBullet"/>
+        <w:contextualSpacing w:val="0"/>
       </w:pPr>
       <w:r>
         <w:t>Contributed the majority of code to a Next.js and TypeScript production reporting platform with real-time dashboards for wind, hydro, solar, and natural gas management teams and senior leadership.</w:t>
@@ -128,6 +134,7 @@
     <w:p>
       <w:pPr>
         <w:pStyle w:val="ListBullet"/>
+        <w:contextualSpacing w:val="0"/>
       </w:pPr>
       <w:r>
         <w:t>Enabled SQL-fluent analysts to create their own dashboards within the platform using reusable ECharts cards and chart presets.</w:t>
@@ -136,6 +143,7 @@
     <w:p>
       <w:pPr>
         <w:pStyle w:val="ListBullet"/>
+        <w:contextualSpacing w:val="0"/>
       </w:pPr>
       <w:r>
         <w:t>Used Databricks as the primary analytics datastore, with PostgreSQL supporting latency-sensitive features such as authentication and comments.</w:t>
@@ -144,14 +152,16 @@
     <w:p>
       <w:pPr>
         <w:pStyle w:val="ListBullet"/>
+        <w:contextualSpacing w:val="0"/>
       </w:pPr>
       <w:r>
-        <w:t>Built a data-catalog workflow with draft submissions, multi-stage review, rework, and audit trails.</w:t>
+        <w:t>Built a data catalog management workflow with draft submissions, multi-stage review, rework, and audit trails.</w:t>
       </w:r>
     </w:p>
     <w:p>
       <w:pPr>
         <w:pStyle w:val="ListBullet"/>
+        <w:contextualSpacing w:val="0"/>
       </w:pPr>
       <w:r>
         <w:t>Implemented Microsoft Entra ID SSO, PostgreSQL-backed sessions, and distributed locking for token refresh across application instances.</w:t>
@@ -160,6 +170,7 @@
     <w:p>
       <w:pPr>
         <w:pStyle w:val="ListBullet"/>
+        <w:contextualSpacing w:val="0"/>
       </w:pPr>
       <w:r>
         <w:t>Built Terraform and GitHub Actions delivery workflows across development, UAT, and production, including release promotion, hotfixes, and rollback.</w:t>
@@ -168,9 +179,10 @@
     <w:p>
       <w:pPr>
         <w:pStyle w:val="ListBullet"/>
+        <w:contextualSpacing w:val="0"/>
       </w:pPr>
       <w:r>
-        <w:t>Worked with management teams, analysts, and data engineers to define reporting requirements, plan tasks, and refine fuel-specific dashboards through user feedback.</w:t>
+        <w:t>Worked with analysts and management teams to define reporting requirements and refine dashboards through user feedback.</w:t>
       </w:r>
     </w:p>
     <w:p>
@@ -192,6 +204,7 @@
     <w:p>
       <w:pPr>
         <w:pStyle w:val="ListBullet"/>
+        <w:contextualSpacing w:val="0"/>
       </w:pPr>
       <w:r>
         <w:t>Refactored legacy React components across the application into smaller, focused modules to improve maintainability. Migrated event data from REST to GraphQL.</w:t>
@@ -200,6 +213,7 @@
     <w:p>
       <w:pPr>
         <w:pStyle w:val="ListBullet"/>
+        <w:contextualSpacing w:val="0"/>
       </w:pPr>
       <w:r>
         <w:t>Built comprehensive mobile and tablet views across the entire application, introducing responsive design where none existed before. Established Docker builds and Azure Pipelines across three environments.</w:t>
@@ -208,6 +222,7 @@
     <w:p>
       <w:pPr>
         <w:pStyle w:val="ListBullet"/>
+        <w:contextualSpacing w:val="0"/>
       </w:pPr>
       <w:r>
         <w:t>Fixed SQL Server connection leaks and strengthened JWT verification. Corrected capacity values, event filtering, and multi-unit CSV exports used in NERC reporting.</w:t>
@@ -233,6 +248,18 @@
     <w:p>
       <w:r>
         <w:t>Developed and maintained automations using Blue Prism and Python scripting. Translated stakeholder requirements into reusable process components and handled testing, scheduled execution, and production troubleshooting.</w:t>
+      </w:r>
+    </w:p>
+    <w:p>
+      <w:pPr>
+        <w:pStyle w:val="Heading1"/>
+        <w:pageBreakBefore/>
+        <w:pBdr>
+          <w:bottom w:val="single" w:sz="6" w:space="5" w:color="0078BF"/>
+        </w:pBdr>
+      </w:pPr>
+      <w:r>
+        <w:t>Earlier experience</w:t>
       </w:r>
     </w:p>
     <w:p>
@@ -282,7 +309,6 @@
     <w:p>
       <w:pPr>
         <w:pStyle w:val="Heading1"/>
-        <w:pageBreakBefore/>
         <w:pBdr>
           <w:bottom w:val="single" w:sz="6" w:space="5" w:color="0078BF"/>
         </w:pBdr>
@@ -302,7 +328,7 @@
     <w:p>
       <w:pPr>
         <w:pStyle w:val="Heading2"/>
-        <w:spacing w:before="240" w:after="40"/>
+        <w:spacing w:before="160" w:after="40"/>
       </w:pPr>
       <w:hyperlink r:id="rId12">
         <w:r>
@@ -316,7 +342,7 @@
     <w:p>
       <w:pPr>
         <w:pStyle w:val="Detail"/>
-        <w:spacing w:after="140"/>
+        <w:spacing w:after="60"/>
       </w:pPr>
       <w:r>
         <w:t>Checkout, inventory, and order management for an independent skateboard brand</w:t>
@@ -338,7 +364,7 @@
     <w:p>
       <w:pPr>
         <w:pStyle w:val="Heading2"/>
-        <w:spacing w:before="240" w:after="40"/>
+        <w:spacing w:before="160" w:after="40"/>
       </w:pPr>
       <w:hyperlink r:id="rId13">
         <w:r>
@@ -352,7 +378,7 @@
     <w:p>
       <w:pPr>
         <w:pStyle w:val="Detail"/>
-        <w:spacing w:after="140"/>
+        <w:spacing w:after="60"/>
       </w:pPr>
       <w:r>
         <w:t>Community skateboarding map for Calgary</w:t>
@@ -374,7 +400,7 @@
     <w:p>
       <w:pPr>
         <w:pStyle w:val="Heading2"/>
-        <w:spacing w:before="240" w:after="40"/>
+        <w:spacing w:before="160" w:after="40"/>
       </w:pPr>
       <w:hyperlink r:id="rId14">
         <w:r>
@@ -388,7 +414,7 @@
     <w:p>
       <w:pPr>
         <w:pStyle w:val="Detail"/>
-        <w:spacing w:after="140"/>
+        <w:spacing w:after="60"/>
       </w:pPr>
       <w:r>
         <w:t>Interactive TypeScript interview practice</w:t>
@@ -420,7 +446,7 @@
     </w:p>
     <w:p>
       <w:pPr>
-        <w:spacing w:after="140"/>
+        <w:spacing w:after="80"/>
       </w:pPr>
       <w:r>
         <w:rPr>
@@ -434,7 +460,7 @@
     </w:p>
     <w:p>
       <w:pPr>
-        <w:spacing w:after="140"/>
+        <w:spacing w:after="80"/>
       </w:pPr>
       <w:r>
         <w:rPr>
@@ -448,7 +474,7 @@
     </w:p>
     <w:p>
       <w:pPr>
-        <w:spacing w:after="140"/>
+        <w:spacing w:after="80"/>
       </w:pPr>
       <w:r>
         <w:rPr>
@@ -462,7 +488,7 @@
     </w:p>
     <w:p>
       <w:pPr>
-        <w:spacing w:after="140"/>
+        <w:spacing w:after="80"/>
       </w:pPr>
       <w:r>
         <w:rPr>
@@ -488,7 +514,7 @@
     <w:p>
       <w:pPr>
         <w:keepLines/>
-        <w:spacing w:after="160"/>
+        <w:spacing w:after="80"/>
       </w:pPr>
       <w:r>
         <w:rPr>
@@ -497,14 +523,13 @@
         <w:t>Object-Oriented Software Development Certificate</w:t>
       </w:r>
       <w:r>
-        <w:br/>
-        <w:t>Southern Alberta Institute of Technology  |  2020 · GPA 3.98</w:t>
+        <w:t xml:space="preserve">  |  Southern Alberta Institute of Technology  |  2020 · GPA 3.98</w:t>
       </w:r>
     </w:p>
     <w:p>
       <w:pPr>
         <w:keepLines/>
-        <w:spacing w:after="160"/>
+        <w:spacing w:after="80"/>
       </w:pPr>
       <w:r>
         <w:rPr>
@@ -513,14 +538,13 @@
         <w:t>Bachelor of Education</w:t>
       </w:r>
       <w:r>
-        <w:br/>
-        <w:t>University of Calgary  |  2016</w:t>
+        <w:t xml:space="preserve">  |  University of Calgary  |  2016</w:t>
       </w:r>
     </w:p>
     <w:p>
       <w:pPr>
         <w:keepLines/>
-        <w:spacing w:after="160"/>
+        <w:spacing w:after="80"/>
       </w:pPr>
       <w:r>
         <w:rPr>
@@ -529,8 +553,7 @@
         <w:t>Bachelor of Arts</w:t>
       </w:r>
       <w:r>
-        <w:br/>
-        <w:t>University of Calgary  |  2011</w:t>
+        <w:t xml:space="preserve">  |  University of Calgary  |  2011</w:t>
       </w:r>
     </w:p>
     <w:sectPr>
@@ -1062,7 +1085,7 @@
     <w:rsid w:val="00FC693F"/>
     <w:pPr>
       <w:widowControl/>
-      <w:spacing w:line="240" w:lineRule="auto" w:after="80"/>
+      <w:spacing w:line="250" w:lineRule="auto" w:after="40"/>
     </w:pPr>
     <w:rPr>
       <w:rFonts w:ascii="Familjen Grotesk" w:hAnsi="Familjen Grotesk" w:eastAsia="Familjen Grotesk" w:cs="Familjen Grotesk"/>
@@ -1128,7 +1151,7 @@
     <w:pPr>
       <w:keepNext/>
       <w:keepLines/>
-      <w:spacing w:before="200" w:after="240"/>
+      <w:spacing w:before="200" w:after="160"/>
       <w:outlineLvl w:val="0"/>
     </w:pPr>
     <w:rPr>
@@ -1180,7 +1203,7 @@
     <w:pPr>
       <w:keepNext/>
       <w:keepLines/>
-      <w:spacing w:before="120" w:after="100"/>
+      <w:spacing w:before="80" w:after="100"/>
       <w:outlineLvl w:val="2"/>
     </w:pPr>
     <w:rPr>
@@ -12782,7 +12805,7 @@
     <w:name w:val="Contact"/>
     <w:pPr>
       <w:keepNext/>
-      <w:spacing w:after="80"/>
+      <w:spacing w:after="40"/>
     </w:pPr>
     <w:rPr>
       <w:rFonts w:ascii="Familjen Grotesk" w:hAnsi="Familjen Grotesk" w:eastAsia="Familjen Grotesk" w:cs="Familjen Grotesk"/>
@@ -12797,7 +12820,7 @@
     <w:name w:val="Detail"/>
     <w:pPr>
       <w:keepNext/>
-      <w:spacing w:after="80"/>
+      <w:spacing w:after="40"/>
     </w:pPr>
     <w:rPr>
       <w:rFonts w:ascii="Familjen Grotesk" w:hAnsi="Familjen Grotesk" w:eastAsia="Familjen Grotesk" w:cs="Familjen Grotesk"/>
@@ -12812,7 +12835,7 @@
     <w:name w:val="Folio"/>
     <w:pPr>
       <w:keepNext/>
-      <w:spacing w:after="80"/>
+      <w:spacing w:after="40"/>
     </w:pPr>
     <w:rPr>
       <w:rFonts w:ascii="Familjen Grotesk" w:hAnsi="Familjen Grotesk" w:eastAsia="Familjen Grotesk" w:cs="Familjen Grotesk"/>

</xml_diff>